<commit_message>
docs(release-items): review package for 9a1b931 — durable stop-rule cancel, integration helper identity, real-PG stop-rule test; corrected gate wording + rollback; narrowed claims; batch 1276 marked failed/degraded; patch b676c2d..9a1b931 (code only)
</commit_message>
<xml_diff>
--- a/deliverables/release-evidence/BRANCH_DIFF.docx
+++ b/deliverables/release-evidence/BRANCH_DIFF.docx
@@ -2,13 +2,25 @@
 <file path=word/document.xml><?xml version="1.0" encoding="utf-8"?>
 <w:document xmlns:w="http://schemas.openxmlformats.org/wordprocessingml/2006/main" xmlns:m="http://schemas.openxmlformats.org/officeDocument/2006/math" xmlns:r="http://schemas.openxmlformats.org/officeDocument/2006/relationships" xmlns:o="urn:schemas-microsoft-com:office:office" xmlns:v="urn:schemas-microsoft-com:vml" xmlns:w10="urn:schemas-microsoft-com:office:word" xmlns:a="http://schemas.openxmlformats.org/drawingml/2006/main" xmlns:pic="http://schemas.openxmlformats.org/drawingml/2006/picture" xmlns:wp="http://schemas.openxmlformats.org/drawingml/2006/wordprocessingDrawing">
   <w:body>
-    <w:bookmarkStart w:id="27" w:name="X1e0a034d84ec7bfa575a4ed51a4c67c3cf66948"/>
+    <w:bookmarkStart w:id="27" w:name="X287323eed7ec99d8cb9a438e6b1d433862e8a77"/>
     <w:p>
       <w:pPr>
         <w:pStyle w:val="Heading1"/>
       </w:pPr>
       <w:r>
-        <w:t xml:space="preserve">Browser lifetime + stop rule: branch diff summary</w:t>
+        <w:t xml:space="preserve">Browser lifetime + stop rule: branch diff summary (release candidate</w:t>
+      </w:r>
+      <w:r>
+        <w:t xml:space="preserve"> </w:t>
+      </w:r>
+      <w:r>
+        <w:rPr>
+          <w:rStyle w:val="VerbatimChar"/>
+        </w:rPr>
+        <w:t xml:space="preserve">9a1b931</w:t>
+      </w:r>
+      <w:r>
+        <w:t xml:space="preserve">)</w:t>
       </w:r>
     </w:p>
     <w:p>
@@ -114,7 +126,7 @@
           <w:bCs/>
           <w:b/>
         </w:rPr>
-        <w:t xml:space="preserve">caaa191</w:t>
+        <w:t xml:space="preserve">9a1b931</w:t>
       </w:r>
       <w:r>
         <w:rPr>
@@ -127,7 +139,19 @@
         <w:t xml:space="preserve"> </w:t>
       </w:r>
       <w:r>
-        <w:t xml:space="preserve">Product code is identical to</w:t>
+        <w:t xml:space="preserve">It adds the reviewer’s release items (durable stop-rule cancel, integration-process identification) on top of</w:t>
+      </w:r>
+      <w:r>
+        <w:t xml:space="preserve"> </w:t>
+      </w:r>
+      <w:r>
+        <w:rPr>
+          <w:rStyle w:val="VerbatimChar"/>
+        </w:rPr>
+        <w:t xml:space="preserve">caaa191</w:t>
+      </w:r>
+      <w:r>
+        <w:t xml:space="preserve">, whose product code is identical to the accepted fix</w:t>
       </w:r>
       <w:r>
         <w:t xml:space="preserve"> </w:t>
@@ -139,22 +163,22 @@
         <w:t xml:space="preserve">f2288ce</w:t>
       </w:r>
       <w:r>
-        <w:t xml:space="preserve">;</w:t>
-      </w:r>
-      <w:r>
-        <w:t xml:space="preserve"> </w:t>
-      </w:r>
-      <w:r>
-        <w:rPr>
-          <w:rStyle w:val="VerbatimChar"/>
-        </w:rPr>
-        <w:t xml:space="preserve">caaa191</w:t>
-      </w:r>
-      <w:r>
-        <w:t xml:space="preserve"> </w:t>
-      </w:r>
-      <w:r>
-        <w:t xml:space="preserve">only changes the repro harness and fixture. The commit that adds these docs and the patch sits on top of it.</w:t>
+        <w:t xml:space="preserve">. The commits that add these docs, the patch and the evidence sit on top of</w:t>
+      </w:r>
+      <w:r>
+        <w:t xml:space="preserve"> </w:t>
+      </w:r>
+      <w:r>
+        <w:rPr>
+          <w:rStyle w:val="VerbatimChar"/>
+        </w:rPr>
+        <w:t xml:space="preserve">9a1b931</w:t>
+      </w:r>
+      <w:r>
+        <w:t xml:space="preserve"> </w:t>
+      </w:r>
+      <w:r>
+        <w:t xml:space="preserve">and change no code.</w:t>
       </w:r>
     </w:p>
     <w:p>
@@ -184,10 +208,52 @@
         <w:rPr>
           <w:rStyle w:val="VerbatimChar"/>
         </w:rPr>
-        <w:t xml:space="preserve">git format-patch b676c2d..caaa191 --stdout</w:t>
-      </w:r>
-      <w:r>
-        <w:t xml:space="preserve">, 4 commits. A patch cannot contain the commit that adds it.</w:t>
+        <w:t xml:space="preserve">git format-patch b676c2d..9a1b931 --stdout -- . ':(exclude)deliverables'</w:t>
+      </w:r>
+      <w:r>
+        <w:t xml:space="preserve">, 4 code commits. Applied to</w:t>
+      </w:r>
+      <w:r>
+        <w:t xml:space="preserve"> </w:t>
+      </w:r>
+      <w:r>
+        <w:rPr>
+          <w:rStyle w:val="VerbatimChar"/>
+        </w:rPr>
+        <w:t xml:space="preserve">b676c2d</w:t>
+      </w:r>
+      <w:r>
+        <w:t xml:space="preserve">, it reproduces the</w:t>
+      </w:r>
+      <w:r>
+        <w:t xml:space="preserve"> </w:t>
+      </w:r>
+      <w:r>
+        <w:rPr>
+          <w:rStyle w:val="VerbatimChar"/>
+        </w:rPr>
+        <w:t xml:space="preserve">9a1b931</w:t>
+      </w:r>
+      <w:r>
+        <w:t xml:space="preserve"> </w:t>
+      </w:r>
+      <w:r>
+        <w:t xml:space="preserve">tree outside</w:t>
+      </w:r>
+      <w:r>
+        <w:t xml:space="preserve"> </w:t>
+      </w:r>
+      <w:r>
+        <w:rPr>
+          <w:rStyle w:val="VerbatimChar"/>
+        </w:rPr>
+        <w:t xml:space="preserve">deliverables/</w:t>
+      </w:r>
+      <w:r>
+        <w:t xml:space="preserve"> </w:t>
+      </w:r>
+      <w:r>
+        <w:t xml:space="preserve">(checked in a throwaway worktree). A patch cannot contain the commit that adds it.</w:t>
       </w:r>
     </w:p>
     <w:p>
@@ -199,16 +265,16 @@
         <w:pStyle w:val="Compact"/>
       </w:pPr>
       <w:r>
-        <w:t xml:space="preserve">No merge, no deploy, no settings/.env change, no paid run. Scoring rules and BM25 are unchanged.</w:t>
-      </w:r>
-    </w:p>
-    <w:bookmarkStart w:id="20" w:name="feature-gates-both-off-by-default"/>
+        <w:t xml:space="preserve">No merge, no deploy, no settings/.env change, no paid run. Scoring rules and BM25 are unchanged. No schema change.</w:t>
+      </w:r>
+    </w:p>
+    <w:bookmarkStart w:id="20" w:name="feature-gates-what-deploying-activates"/>
     <w:p>
       <w:pPr>
         <w:pStyle w:val="Heading2"/>
       </w:pPr>
       <w:r>
-        <w:t xml:space="preserve">Feature gates (both off by default)</w:t>
+        <w:t xml:space="preserve">Feature gates — what deploying activates</w:t>
       </w:r>
     </w:p>
     <w:tbl>
@@ -259,7 +325,7 @@
               <w:jc w:val="left"/>
             </w:pPr>
             <w:r>
-              <w:t xml:space="preserve">Default production behaviour</w:t>
+              <w:t xml:space="preserve">Effect of deploying to production as configured today</w:t>
             </w:r>
           </w:p>
         </w:tc>
@@ -285,13 +351,7 @@
               <w:jc w:val="left"/>
             </w:pPr>
             <w:r>
-              <w:rPr>
-                <w:rStyle w:val="VerbatimChar"/>
-              </w:rPr>
-              <w:t xml:space="preserve">WORKER_ISOLATION_ENABLED=true</w:t>
-            </w:r>
-            <w:r>
-              <w:t xml:space="preserve">, in isolated job children only (</w:t>
+              <w:t xml:space="preserve">Isolated job children (</w:t>
             </w:r>
             <w:r>
               <w:rPr>
@@ -300,7 +360,13 @@
               <w:t xml:space="preserve">isIsolatedChild()</w:t>
             </w:r>
             <w:r>
-              <w:t xml:space="preserve">)</w:t>
+              <w:t xml:space="preserve">), i.e. </w:t>
+            </w:r>
+            <w:r>
+              <w:rPr>
+                <w:rStyle w:val="VerbatimChar"/>
+              </w:rPr>
+              <w:t xml:space="preserve">WORKER_ISOLATION_ENABLED=true</w:t>
             </w:r>
           </w:p>
         </w:tc>
@@ -312,7 +378,29 @@
               <w:jc w:val="left"/>
             </w:pPr>
             <w:r>
-              <w:t xml:space="preserve">Inert. The in-process</w:t>
+              <w:rPr>
+                <w:bCs/>
+                <w:b/>
+              </w:rPr>
+              <w:t xml:space="preserve">Active immediately.</w:t>
+            </w:r>
+            <w:r>
+              <w:t xml:space="preserve"> </w:t>
+            </w:r>
+            <w:r>
+              <w:t xml:space="preserve">Production already runs with</w:t>
+            </w:r>
+            <w:r>
+              <w:t xml:space="preserve"> </w:t>
+            </w:r>
+            <w:r>
+              <w:rPr>
+                <w:rStyle w:val="VerbatimChar"/>
+              </w:rPr>
+              <w:t xml:space="preserve">WORKER_ISOLATION_ENABLED=true</w:t>
+            </w:r>
+            <w:r>
+              <w:t xml:space="preserve">, so there is no off switch for the fix short of reverting the deploy. (The in-process</w:t>
             </w:r>
             <w:r>
               <w:t xml:space="preserve"> </w:t>
@@ -327,7 +415,7 @@
               <w:t xml:space="preserve"> </w:t>
             </w:r>
             <w:r>
-              <w:t xml:space="preserve">path is unchanged, apart from now returning a resolved Promise that callers</w:t>
+              <w:t xml:space="preserve">path is unchanged, apart from returning a resolved Promise that callers</w:t>
             </w:r>
             <w:r>
               <w:t xml:space="preserve"> </w:t>
@@ -339,7 +427,7 @@
               <w:t xml:space="preserve">await</w:t>
             </w:r>
             <w:r>
-              <w:t xml:space="preserve">.</w:t>
+              <w:t xml:space="preserve">.)</w:t>
             </w:r>
           </w:p>
         </w:tc>
@@ -374,7 +462,7 @@
               <w:t xml:space="preserve"> </w:t>
             </w:r>
             <w:r>
-              <w:t xml:space="preserve">= N &gt; 0 (both the isolated and in-process worker paths)</w:t>
+              <w:t xml:space="preserve">= N &gt; 0 (isolated and in-process worker paths)</w:t>
             </w:r>
           </w:p>
         </w:tc>
@@ -386,20 +474,32 @@
               <w:jc w:val="left"/>
             </w:pPr>
             <w:r>
-              <w:t xml:space="preserve">Inert. If the variable is unset, 0 or invalid, the retry path is the legacy one; test 9 checks this.</w:t>
+              <w:rPr>
+                <w:bCs/>
+                <w:b/>
+              </w:rPr>
+              <w:t xml:space="preserve">Inert</w:t>
+            </w:r>
+            <w:r>
+              <w:t xml:space="preserve"> </w:t>
+            </w:r>
+            <w:r>
+              <w:t xml:space="preserve">until the variable is set. If it is unset, 0 or invalid, the retry path is the legacy one; test 9 checks this.</w:t>
             </w:r>
           </w:p>
         </w:tc>
       </w:tr>
     </w:tbl>
-    <w:bookmarkEnd w:id="20"/>
-    <w:bookmarkStart w:id="21" w:name="commits-since-base"/>
-    <w:p>
-      <w:pPr>
-        <w:pStyle w:val="Heading2"/>
-      </w:pPr>
-      <w:r>
-        <w:t xml:space="preserve">Commits since base</w:t>
+    <w:p>
+      <w:pPr>
+        <w:pStyle w:val="BodyText"/>
+      </w:pPr>
+      <w:r>
+        <w:rPr>
+          <w:bCs/>
+          <w:b/>
+        </w:rPr>
+        <w:t xml:space="preserve">Rollback.</w:t>
       </w:r>
     </w:p>
     <w:p>
@@ -411,16 +511,16 @@
         <w:pStyle w:val="Compact"/>
       </w:pPr>
       <w:r>
-        <w:rPr>
-          <w:rStyle w:val="VerbatimChar"/>
-        </w:rPr>
-        <w:t xml:space="preserve">caaa191</w:t>
-      </w:r>
-      <w:r>
-        <w:t xml:space="preserve"> </w:t>
-      </w:r>
-      <w:r>
-        <w:t xml:space="preserve">test(browser-lifetime): per-document marker extraction, no-skip check, admission wait / permit hold / wall time in repro summary</w:t>
+        <w:t xml:space="preserve">Redeploy the previous production image/commit (</w:t>
+      </w:r>
+      <w:r>
+        <w:rPr>
+          <w:rStyle w:val="VerbatimChar"/>
+        </w:rPr>
+        <w:t xml:space="preserve">b676c2d</w:t>
+      </w:r>
+      <w:r>
+        <w:t xml:space="preserve">, or the prior production deploy as recorded in the deploy history).</w:t>
       </w:r>
     </w:p>
     <w:p>
@@ -432,20 +532,22 @@
         <w:pStyle w:val="Compact"/>
       </w:pPr>
       <w:r>
-        <w:rPr>
-          <w:rStyle w:val="VerbatimChar"/>
-        </w:rPr>
-        <w:t xml:space="preserve">f2288ce</w:t>
-      </w:r>
-      <w:r>
-        <w:t xml:space="preserve"> </w:t>
-      </w:r>
-      <w:r>
-        <w:rPr>
-          <w:bCs/>
-          <w:b/>
-        </w:rPr>
-        <w:t xml:space="preserve">fix(worker-isolation): close+reap the child’s Chromium before returning the browser permit; opt-in batch stop rule S4</w:t>
+        <w:t xml:space="preserve">To turn off only the stop rule: unset</w:t>
+      </w:r>
+      <w:r>
+        <w:t xml:space="preserve"> </w:t>
+      </w:r>
+      <w:r>
+        <w:rPr>
+          <w:rStyle w:val="VerbatimChar"/>
+        </w:rPr>
+        <w:t xml:space="preserve">BATCH_STOP_RULE_FAILED_JOBS</w:t>
+      </w:r>
+      <w:r>
+        <w:t xml:space="preserve"> </w:t>
+      </w:r>
+      <w:r>
+        <w:t xml:space="preserve">or set it to 0.</w:t>
       </w:r>
     </w:p>
     <w:p>
@@ -457,268 +559,48 @@
         <w:pStyle w:val="Compact"/>
       </w:pPr>
       <w:r>
-        <w:rPr>
-          <w:rStyle w:val="VerbatimChar"/>
-        </w:rPr>
-        <w:t xml:space="preserve">f3825cf</w:t>
-      </w:r>
-      <w:r>
-        <w:t xml:space="preserve"> </w:t>
-      </w:r>
-      <w:r>
-        <w:t xml:space="preserve">evidence(browser-lifetime): before/after repro runs (unlimited + TasksMax=400) with corrected per-profile browser counter (superseded by</w:t>
-      </w:r>
-      <w:r>
-        <w:t xml:space="preserve"> </w:t>
-      </w:r>
-      <w:r>
-        <w:rPr>
-          <w:rStyle w:val="VerbatimChar"/>
-        </w:rPr>
-        <w:t xml:space="preserve">evidence/browser-lifetime-candidate/</w:t>
-      </w:r>
-      <w:r>
-        <w:t xml:space="preserve">)</w:t>
-      </w:r>
-    </w:p>
-    <w:p>
-      <w:pPr>
-        <w:numPr>
-          <w:ilvl w:val="0"/>
-          <w:numId w:val="1002"/>
-        </w:numPr>
-        <w:pStyle w:val="Compact"/>
-      </w:pPr>
-      <w:r>
-        <w:rPr>
-          <w:rStyle w:val="VerbatimChar"/>
-        </w:rPr>
-        <w:t xml:space="preserve">979db79</w:t>
-      </w:r>
-      <w:r>
-        <w:t xml:space="preserve"> </w:t>
-      </w:r>
-      <w:r>
-        <w:t xml:space="preserve">test(browser-lifetime): repro harness + fixture; count one browser per distinct puppeteer profile</w:t>
-      </w:r>
-    </w:p>
-    <w:bookmarkEnd w:id="21"/>
-    <w:bookmarkStart w:id="22" w:name="X70910191190aa92866c0d24b9eadf1027ac286d"/>
-    <w:p>
-      <w:pPr>
-        <w:pStyle w:val="Heading2"/>
-      </w:pPr>
-      <w:r>
-        <w:t xml:space="preserve">Code/test files changed (</w:t>
-      </w:r>
-      <w:r>
-        <w:rPr>
-          <w:rStyle w:val="VerbatimChar"/>
-        </w:rPr>
-        <w:t xml:space="preserve">git diff --stat b676c2d caaa191</w:t>
-      </w:r>
-      <w:r>
-        <w:t xml:space="preserve">, excluding deliverables/)</w:t>
-      </w:r>
-    </w:p>
-    <w:p>
-      <w:pPr>
-        <w:pStyle w:val="SourceCode"/>
-      </w:pPr>
-      <w:r>
-        <w:rPr>
-          <w:rStyle w:val="VerbatimChar"/>
-        </w:rPr>
-        <w:t xml:space="preserve"> server/lib/__fixtures__/browser-close-order-child.ts |  40 +++</w:t>
-      </w:r>
-      <w:r>
-        <w:br/>
-      </w:r>
-      <w:r>
-        <w:rPr>
-          <w:rStyle w:val="VerbatimChar"/>
-        </w:rPr>
-        <w:t xml:space="preserve"> server/lib/__fixtures__/browser-lifetime-child.ts    |  43 +++</w:t>
-      </w:r>
-      <w:r>
-        <w:br/>
-      </w:r>
-      <w:r>
-        <w:rPr>
-          <w:rStyle w:val="VerbatimChar"/>
-        </w:rPr>
-        <w:t xml:space="preserve"> server/lib/__fixtures__/marker-pdf.ts                |  27 +++</w:t>
-      </w:r>
-      <w:r>
-        <w:br/>
-      </w:r>
-      <w:r>
-        <w:rPr>
-          <w:rStyle w:val="VerbatimChar"/>
-        </w:rPr>
-        <w:t xml:space="preserve"> server/lib/batch-stop-rule.test.ts                   | 175 +++++</w:t>
-      </w:r>
-      <w:r>
-        <w:br/>
-      </w:r>
-      <w:r>
-        <w:rPr>
-          <w:rStyle w:val="VerbatimChar"/>
-        </w:rPr>
-        <w:t xml:space="preserve"> server/lib/batch-stop-rule.ts                        | 137 +++++</w:t>
-      </w:r>
-      <w:r>
-        <w:br/>
-      </w:r>
-      <w:r>
-        <w:rPr>
-          <w:rStyle w:val="VerbatimChar"/>
-        </w:rPr>
-        <w:t xml:space="preserve"> server/lib/browser-close-order.test.ts               | 150 +++++</w:t>
-      </w:r>
-      <w:r>
-        <w:br/>
-      </w:r>
-      <w:r>
-        <w:rPr>
-          <w:rStyle w:val="VerbatimChar"/>
-        </w:rPr>
-        <w:t xml:space="preserve"> server/lib/processor.ts                              | 144 ++++-</w:t>
-      </w:r>
-      <w:r>
-        <w:br/>
-      </w:r>
-      <w:r>
-        <w:rPr>
-          <w:rStyle w:val="VerbatimChar"/>
-        </w:rPr>
-        <w:t xml:space="preserve"> server/scripts/browser-lifetime-repro.ts             | 232 +++++++</w:t>
-      </w:r>
-      <w:r>
-        <w:br/>
-      </w:r>
-      <w:r>
-        <w:rPr>
-          <w:rStyle w:val="VerbatimChar"/>
-        </w:rPr>
-        <w:t xml:space="preserve"> server/worker.ts                                     |  34 +</w:t>
-      </w:r>
-      <w:r>
-        <w:br/>
-      </w:r>
-      <w:r>
-        <w:rPr>
-          <w:rStyle w:val="VerbatimChar"/>
-        </w:rPr>
-        <w:t xml:space="preserve"> 9 files changed, 970 insertions(+), 12 deletions(-)</w:t>
-      </w:r>
-    </w:p>
-    <w:p>
-      <w:pPr>
-        <w:pStyle w:val="FirstParagraph"/>
-      </w:pPr>
-      <w:r>
-        <w:t xml:space="preserve">The only product files changed are</w:t>
-      </w:r>
-      <w:r>
-        <w:t xml:space="preserve"> </w:t>
-      </w:r>
-      <w:r>
-        <w:rPr>
-          <w:rStyle w:val="VerbatimChar"/>
-        </w:rPr>
-        <w:t xml:space="preserve">processor.ts</w:t>
-      </w:r>
-      <w:r>
-        <w:t xml:space="preserve">,</w:t>
-      </w:r>
-      <w:r>
-        <w:t xml:space="preserve"> </w:t>
-      </w:r>
-      <w:r>
-        <w:rPr>
-          <w:rStyle w:val="VerbatimChar"/>
-        </w:rPr>
-        <w:t xml:space="preserve">worker.ts</w:t>
-      </w:r>
-      <w:r>
-        <w:t xml:space="preserve"> </w:t>
-      </w:r>
-      <w:r>
-        <w:t xml:space="preserve">and the new</w:t>
-      </w:r>
-      <w:r>
-        <w:t xml:space="preserve"> </w:t>
-      </w:r>
-      <w:r>
-        <w:rPr>
-          <w:rStyle w:val="VerbatimChar"/>
-        </w:rPr>
-        <w:t xml:space="preserve">batch-stop-rule.ts</w:t>
-      </w:r>
-      <w:r>
-        <w:t xml:space="preserve">. Everything else is tests, fixtures or the repro script. The full diff including the old evidence JSON is 14 files, +51,086/−12.</w:t>
-      </w:r>
-    </w:p>
-    <w:bookmarkEnd w:id="22"/>
-    <w:bookmarkStart w:id="25" w:name="what-changed"/>
-    <w:p>
-      <w:pPr>
-        <w:pStyle w:val="Heading2"/>
-      </w:pPr>
-      <w:r>
-        <w:t xml:space="preserve">What changed</w:t>
-      </w:r>
-    </w:p>
-    <w:bookmarkStart w:id="23" w:name="Xcda47503f5e0d2ec96407fd4f0322049331da84"/>
-    <w:p>
-      <w:pPr>
-        <w:pStyle w:val="Heading3"/>
-      </w:pPr>
-      <w:r>
-        <w:t xml:space="preserve">server/lib/processor.ts: browser lifetime in isolated children</w:t>
-      </w:r>
-    </w:p>
-    <w:p>
-      <w:pPr>
-        <w:pStyle w:val="FirstParagraph"/>
-      </w:pPr>
+        <w:t xml:space="preserve">Do</w:t>
+      </w:r>
+      <w:r>
+        <w:t xml:space="preserve"> </w:t>
+      </w:r>
       <w:r>
         <w:rPr>
           <w:bCs/>
           <w:b/>
         </w:rPr>
-        <w:t xml:space="preserve">Defect.</w:t>
-      </w:r>
-      <w:r>
-        <w:t xml:space="preserve"> </w:t>
-      </w:r>
-      <w:r>
-        <w:t xml:space="preserve">In an isolated child, the browser permit, which the parent brokers per replica up to</w:t>
-      </w:r>
-      <w:r>
-        <w:t xml:space="preserve"> </w:t>
-      </w:r>
-      <w:r>
-        <w:rPr>
-          <w:rStyle w:val="VerbatimChar"/>
-        </w:rPr>
-        <w:t xml:space="preserve">MAX_CONCURRENT_BROWSER</w:t>
-      </w:r>
-      <w:r>
-        <w:t xml:space="preserve">, went back to the pool after every fetch. The child’s Chromium stayed alive until the child exited, minutes later. So the number of live browsers per replica was bounded by the child count, not by the permit count. Locally that gave 4 live browsers with 1 permit.</w:t>
-      </w:r>
-    </w:p>
-    <w:p>
-      <w:pPr>
-        <w:pStyle w:val="BodyText"/>
-      </w:pPr>
-      <w:r>
-        <w:rPr>
-          <w:bCs/>
-          <w:b/>
-        </w:rPr>
-        <w:t xml:space="preserve">Fix</w:t>
+        <w:t xml:space="preserve">not</w:t>
+      </w:r>
+      <w:r>
+        <w:t xml:space="preserve"> </w:t>
+      </w:r>
+      <w:r>
+        <w:t xml:space="preserve">disable</w:t>
+      </w:r>
+      <w:r>
+        <w:t xml:space="preserve"> </w:t>
+      </w:r>
+      <w:r>
+        <w:rPr>
+          <w:rStyle w:val="VerbatimChar"/>
+        </w:rPr>
+        <w:t xml:space="preserve">WORKER_ISOLATION_ENABLED</w:t>
+      </w:r>
+      <w:r>
+        <w:t xml:space="preserve"> </w:t>
+      </w:r>
+      <w:r>
+        <w:t xml:space="preserve">as the rollback; reverting the deploy is the rollback.</w:t>
+      </w:r>
+    </w:p>
+    <w:bookmarkEnd w:id="20"/>
+    <w:bookmarkStart w:id="21" w:name="commits-since-base-code"/>
+    <w:p>
+      <w:pPr>
+        <w:pStyle w:val="Heading2"/>
+      </w:pPr>
+      <w:r>
+        <w:t xml:space="preserve">Commits since base (code)</w:t>
       </w:r>
     </w:p>
     <w:p>
@@ -733,25 +615,7 @@
         <w:rPr>
           <w:rStyle w:val="VerbatimChar"/>
         </w:rPr>
-        <w:t xml:space="preserve">releaseBrowserSlot()</w:t>
-      </w:r>
-      <w:r>
-        <w:t xml:space="preserve"> </w:t>
-      </w:r>
-      <w:r>
-        <w:t xml:space="preserve">now returns a Promise. In an isolated child it calls</w:t>
-      </w:r>
-      <w:r>
-        <w:t xml:space="preserve"> </w:t>
-      </w:r>
-      <w:r>
-        <w:rPr>
-          <w:rStyle w:val="VerbatimChar"/>
-        </w:rPr>
-        <w:t xml:space="preserve">releaseChildBrowserPermit()</w:t>
-      </w:r>
-      <w:r>
-        <w:t xml:space="preserve">. When the child releases its</w:t>
+        <w:t xml:space="preserve">9a1b931</w:t>
       </w:r>
       <w:r>
         <w:t xml:space="preserve"> </w:t>
@@ -761,109 +625,13 @@
           <w:bCs/>
           <w:b/>
         </w:rPr>
-        <w:t xml:space="preserve">last</w:t>
-      </w:r>
-      <w:r>
-        <w:t xml:space="preserve"> </w:t>
-      </w:r>
-      <w:r>
-        <w:t xml:space="preserve">held permit, that function does three things in order:</w:t>
-      </w:r>
-    </w:p>
-    <w:p>
-      <w:pPr>
-        <w:numPr>
-          <w:ilvl w:val="1"/>
-          <w:numId w:val="1004"/>
-        </w:numPr>
-        <w:pStyle w:val="Compact"/>
-      </w:pPr>
-      <w:r>
-        <w:t xml:space="preserve">It detaches every Chromium the child launched (</w:t>
-      </w:r>
-      <w:r>
-        <w:rPr>
-          <w:rStyle w:val="VerbatimChar"/>
-        </w:rPr>
-        <w:t xml:space="preserve">childBrowsers</w:t>
-      </w:r>
-      <w:r>
-        <w:t xml:space="preserve">,</w:t>
-      </w:r>
-      <w:r>
-        <w:t xml:space="preserve"> </w:t>
-      </w:r>
-      <w:r>
-        <w:rPr>
-          <w:rStyle w:val="VerbatimChar"/>
-        </w:rPr>
-        <w:t xml:space="preserve">sharedBrowser = null</w:t>
-      </w:r>
-      <w:r>
-        <w:t xml:space="preserve">).</w:t>
-      </w:r>
-    </w:p>
-    <w:p>
-      <w:pPr>
-        <w:numPr>
-          <w:ilvl w:val="1"/>
-          <w:numId w:val="1004"/>
-        </w:numPr>
-        <w:pStyle w:val="Compact"/>
-      </w:pPr>
-      <w:r>
-        <w:t xml:space="preserve">It closes each one (</w:t>
-      </w:r>
-      <w:r>
-        <w:rPr>
-          <w:rStyle w:val="VerbatimChar"/>
-        </w:rPr>
-        <w:t xml:space="preserve">close()</w:t>
-      </w:r>
-      <w:r>
-        <w:t xml:space="preserve"> </w:t>
-      </w:r>
-      <w:r>
-        <w:t xml:space="preserve">with a 5 s timeout) and confirms the process group is gone by scanning</w:t>
-      </w:r>
-      <w:r>
-        <w:t xml:space="preserve"> </w:t>
-      </w:r>
-      <w:r>
-        <w:rPr>
-          <w:rStyle w:val="VerbatimChar"/>
-        </w:rPr>
-        <w:t xml:space="preserve">/proc</w:t>
-      </w:r>
-      <w:r>
-        <w:t xml:space="preserve"> </w:t>
-      </w:r>
-      <w:r>
-        <w:t xml:space="preserve">for non-zombie members of the pgid. If the group survives a 5 s window, it sends SIGKILL to the group and checks again.</w:t>
-      </w:r>
-    </w:p>
-    <w:p>
-      <w:pPr>
-        <w:numPr>
-          <w:ilvl w:val="1"/>
-          <w:numId w:val="1004"/>
-        </w:numPr>
-        <w:pStyle w:val="Compact"/>
-      </w:pPr>
-      <w:r>
-        <w:t xml:space="preserve">Only then does it call</w:t>
-      </w:r>
-      <w:r>
-        <w:t xml:space="preserve"> </w:t>
-      </w:r>
-      <w:r>
-        <w:rPr>
-          <w:rStyle w:val="VerbatimChar"/>
-        </w:rPr>
-        <w:t xml:space="preserve">remoteRelease("browser")</w:t>
-      </w:r>
-      <w:r>
-        <w:t xml:space="preserve">.</w:t>
+        <w:t xml:space="preserve">fix(stop-rule): durable-first cancel with bounded purge/snapshot; mark stop-rule snapshot cancelled/partial</w:t>
+      </w:r>
+      <w:r>
+        <w:t xml:space="preserve"> </w:t>
+      </w:r>
+      <w:r>
+        <w:t xml:space="preserve">(+ real-PG stop-rule test, integration descendant identities)</w:t>
       </w:r>
     </w:p>
     <w:p>
@@ -875,7 +643,16 @@
         <w:pStyle w:val="Compact"/>
       </w:pPr>
       <w:r>
-        <w:t xml:space="preserve">If there is no pid to probe, only a close that completed counts as confirmed.</w:t>
+        <w:rPr>
+          <w:rStyle w:val="VerbatimChar"/>
+        </w:rPr>
+        <w:t xml:space="preserve">caaa191</w:t>
+      </w:r>
+      <w:r>
+        <w:t xml:space="preserve"> </w:t>
+      </w:r>
+      <w:r>
+        <w:t xml:space="preserve">test(browser-lifetime): per-document marker extraction, no-skip check, admission wait / permit hold / wall time in repro summary</w:t>
       </w:r>
     </w:p>
     <w:p>
@@ -888,44 +665,19 @@
       </w:pPr>
       <w:r>
         <w:rPr>
+          <w:rStyle w:val="VerbatimChar"/>
+        </w:rPr>
+        <w:t xml:space="preserve">f2288ce</w:t>
+      </w:r>
+      <w:r>
+        <w:t xml:space="preserve"> </w:t>
+      </w:r>
+      <w:r>
+        <w:rPr>
           <w:bCs/>
           <w:b/>
         </w:rPr>
-        <w:t xml:space="preserve">Unconfirmed cleanup.</w:t>
-      </w:r>
-      <w:r>
-        <w:t xml:space="preserve"> </w:t>
-      </w:r>
-      <w:r>
-        <w:t xml:space="preserve">The permit is</w:t>
-      </w:r>
-      <w:r>
-        <w:t xml:space="preserve"> </w:t>
-      </w:r>
-      <w:r>
-        <w:rPr>
-          <w:bCs/>
-          <w:b/>
-        </w:rPr>
-        <w:t xml:space="preserve">withheld</w:t>
-      </w:r>
-      <w:r>
-        <w:t xml:space="preserve">, not returned, and</w:t>
-      </w:r>
-      <w:r>
-        <w:t xml:space="preserve"> </w:t>
-      </w:r>
-      <w:r>
-        <w:rPr>
-          <w:rStyle w:val="VerbatimChar"/>
-        </w:rPr>
-        <w:t xml:space="preserve">childBrowserRetireFailed</w:t>
-      </w:r>
-      <w:r>
-        <w:t xml:space="preserve"> </w:t>
-      </w:r>
-      <w:r>
-        <w:t xml:space="preserve">opens the browser circuit for that child, so it cannot deadlock itself. The parent reaps the process when the child exits.</w:t>
+        <w:t xml:space="preserve">fix(worker-isolation): close+reap the child’s Chromium before returning the browser permit; opt-in batch stop rule S4</w:t>
       </w:r>
     </w:p>
     <w:p>
@@ -937,61 +689,28 @@
         <w:pStyle w:val="Compact"/>
       </w:pPr>
       <w:r>
-        <w:t xml:space="preserve">All three callers await the release, on the normal, refused-after-acquire and finally paths:</w:t>
-      </w:r>
-      <w:r>
-        <w:t xml:space="preserve"> </w:t>
-      </w:r>
-      <w:r>
-        <w:rPr>
-          <w:rStyle w:val="VerbatimChar"/>
-        </w:rPr>
-        <w:t xml:space="preserve">fetchWithBrowser</w:t>
-      </w:r>
-      <w:r>
-        <w:t xml:space="preserve">,</w:t>
-      </w:r>
-      <w:r>
-        <w:t xml:space="preserve"> </w:t>
-      </w:r>
-      <w:r>
-        <w:rPr>
-          <w:rStyle w:val="VerbatimChar"/>
-        </w:rPr>
-        <w:t xml:space="preserve">fetchPdfViaBrowser</w:t>
-      </w:r>
-      <w:r>
-        <w:t xml:space="preserve"> </w:t>
-      </w:r>
-      <w:r>
-        <w:t xml:space="preserve">and</w:t>
-      </w:r>
-      <w:r>
-        <w:t xml:space="preserve"> </w:t>
-      </w:r>
-      <w:r>
-        <w:rPr>
-          <w:rStyle w:val="VerbatimChar"/>
-        </w:rPr>
-        <w:t xml:space="preserve">fetchIssuerPdfsWithPrimedSession</w:t>
-      </w:r>
-      <w:r>
-        <w:t xml:space="preserve">.</w:t>
-      </w:r>
-      <w:r>
-        <w:t xml:space="preserve"> </w:t>
-      </w:r>
-      <w:r>
-        <w:rPr>
-          <w:rStyle w:val="VerbatimChar"/>
-        </w:rPr>
-        <w:t xml:space="preserve">fetchIssuerPdfsWithPrimedSession</w:t>
-      </w:r>
-      <w:r>
-        <w:t xml:space="preserve"> </w:t>
-      </w:r>
-      <w:r>
-        <w:t xml:space="preserve">also returns early if the circuit is open.</w:t>
+        <w:rPr>
+          <w:rStyle w:val="VerbatimChar"/>
+        </w:rPr>
+        <w:t xml:space="preserve">f3825cf</w:t>
+      </w:r>
+      <w:r>
+        <w:t xml:space="preserve"> </w:t>
+      </w:r>
+      <w:r>
+        <w:t xml:space="preserve">evidence(browser-lifetime): before/after repro runs (unlimited + TasksMax=400) with corrected per-profile browser counter (superseded by</w:t>
+      </w:r>
+      <w:r>
+        <w:t xml:space="preserve"> </w:t>
+      </w:r>
+      <w:r>
+        <w:rPr>
+          <w:rStyle w:val="VerbatimChar"/>
+        </w:rPr>
+        <w:t xml:space="preserve">evidence/browser-lifetime-candidate/</w:t>
+      </w:r>
+      <w:r>
+        <w:t xml:space="preserve">)</w:t>
       </w:r>
     </w:p>
     <w:p>
@@ -1004,56 +723,328 @@
       </w:pPr>
       <w:r>
         <w:rPr>
+          <w:rStyle w:val="VerbatimChar"/>
+        </w:rPr>
+        <w:t xml:space="preserve">979db79</w:t>
+      </w:r>
+      <w:r>
+        <w:t xml:space="preserve"> </w:t>
+      </w:r>
+      <w:r>
+        <w:t xml:space="preserve">test(browser-lifetime): repro harness + fixture; count one browser per distinct puppeteer profile</w:t>
+      </w:r>
+    </w:p>
+    <w:bookmarkEnd w:id="21"/>
+    <w:bookmarkStart w:id="22" w:name="Xcb247b50bc18a35ab4711f2fb84c31b44c0a018"/>
+    <w:p>
+      <w:pPr>
+        <w:pStyle w:val="Heading2"/>
+      </w:pPr>
+      <w:r>
+        <w:t xml:space="preserve">Code/test files changed (</w:t>
+      </w:r>
+      <w:r>
+        <w:rPr>
+          <w:rStyle w:val="VerbatimChar"/>
+        </w:rPr>
+        <w:t xml:space="preserve">git diff --stat b676c2d 9a1b931</w:t>
+      </w:r>
+      <w:r>
+        <w:t xml:space="preserve">, excluding deliverables/)</w:t>
+      </w:r>
+    </w:p>
+    <w:p>
+      <w:pPr>
+        <w:pStyle w:val="SourceCode"/>
+      </w:pPr>
+      <w:r>
+        <w:rPr>
+          <w:rStyle w:val="VerbatimChar"/>
+        </w:rPr>
+        <w:t xml:space="preserve"> server/lib/__fixtures__/browser-close-order-child.ts |  40 ++++</w:t>
+      </w:r>
+      <w:r>
+        <w:br/>
+      </w:r>
+      <w:r>
+        <w:rPr>
+          <w:rStyle w:val="VerbatimChar"/>
+        </w:rPr>
+        <w:t xml:space="preserve"> server/lib/__fixtures__/browser-lifetime-child.ts    |  43 ++++</w:t>
+      </w:r>
+      <w:r>
+        <w:br/>
+      </w:r>
+      <w:r>
+        <w:rPr>
+          <w:rStyle w:val="VerbatimChar"/>
+        </w:rPr>
+        <w:t xml:space="preserve"> server/lib/__fixtures__/marker-pdf.ts                |  27 +++</w:t>
+      </w:r>
+      <w:r>
+        <w:br/>
+      </w:r>
+      <w:r>
+        <w:rPr>
+          <w:rStyle w:val="VerbatimChar"/>
+        </w:rPr>
+        <w:t xml:space="preserve"> server/lib/batch-stop-rule.db.test.ts                | 159 ++++++++++++++</w:t>
+      </w:r>
+      <w:r>
+        <w:br/>
+      </w:r>
+      <w:r>
+        <w:rPr>
+          <w:rStyle w:val="VerbatimChar"/>
+        </w:rPr>
+        <w:t xml:space="preserve"> server/lib/batch-stop-rule.test.ts                   | 238 +++++++++++++++++++++</w:t>
+      </w:r>
+      <w:r>
+        <w:br/>
+      </w:r>
+      <w:r>
+        <w:rPr>
+          <w:rStyle w:val="VerbatimChar"/>
+        </w:rPr>
+        <w:t xml:space="preserve"> server/lib/batch-stop-rule.ts                        | 184 ++++++++++++++++</w:t>
+      </w:r>
+      <w:r>
+        <w:br/>
+      </w:r>
+      <w:r>
+        <w:rPr>
+          <w:rStyle w:val="VerbatimChar"/>
+        </w:rPr>
+        <w:t xml:space="preserve"> server/lib/browser-close-order.test.ts               | 150 +++++++++++++</w:t>
+      </w:r>
+      <w:r>
+        <w:br/>
+      </w:r>
+      <w:r>
+        <w:rPr>
+          <w:rStyle w:val="VerbatimChar"/>
+        </w:rPr>
+        <w:t xml:space="preserve"> server/lib/job-isolation.integration.test.ts         |  49 ++++-</w:t>
+      </w:r>
+      <w:r>
+        <w:br/>
+      </w:r>
+      <w:r>
+        <w:rPr>
+          <w:rStyle w:val="VerbatimChar"/>
+        </w:rPr>
+        <w:t xml:space="preserve"> server/lib/lifecycle-fence.db.test.ts                |   2 +-</w:t>
+      </w:r>
+      <w:r>
+        <w:br/>
+      </w:r>
+      <w:r>
+        <w:rPr>
+          <w:rStyle w:val="VerbatimChar"/>
+        </w:rPr>
+        <w:t xml:space="preserve"> server/lib/processor.ts                              | 144 +++++++++++--</w:t>
+      </w:r>
+      <w:r>
+        <w:br/>
+      </w:r>
+      <w:r>
+        <w:rPr>
+          <w:rStyle w:val="VerbatimChar"/>
+        </w:rPr>
+        <w:t xml:space="preserve"> server/scripts/browser-lifetime-repro.ts             | 232 ++++++++++++++++++++</w:t>
+      </w:r>
+      <w:r>
+        <w:br/>
+      </w:r>
+      <w:r>
+        <w:rPr>
+          <w:rStyle w:val="VerbatimChar"/>
+        </w:rPr>
+        <w:t xml:space="preserve"> server/storage.ts                                    |   6 +-</w:t>
+      </w:r>
+      <w:r>
+        <w:br/>
+      </w:r>
+      <w:r>
+        <w:rPr>
+          <w:rStyle w:val="VerbatimChar"/>
+        </w:rPr>
+        <w:t xml:space="preserve"> server/worker.ts                                     |  46 ++++</w:t>
+      </w:r>
+      <w:r>
+        <w:br/>
+      </w:r>
+      <w:r>
+        <w:rPr>
+          <w:rStyle w:val="VerbatimChar"/>
+        </w:rPr>
+        <w:t xml:space="preserve"> 13 files changed, 1299 insertions(+), 21 deletions(-)</w:t>
+      </w:r>
+    </w:p>
+    <w:p>
+      <w:pPr>
+        <w:pStyle w:val="FirstParagraph"/>
+      </w:pPr>
+      <w:r>
+        <w:t xml:space="preserve">The product files changed are</w:t>
+      </w:r>
+      <w:r>
+        <w:t xml:space="preserve"> </w:t>
+      </w:r>
+      <w:r>
+        <w:rPr>
+          <w:rStyle w:val="VerbatimChar"/>
+        </w:rPr>
+        <w:t xml:space="preserve">processor.ts</w:t>
+      </w:r>
+      <w:r>
+        <w:t xml:space="preserve">,</w:t>
+      </w:r>
+      <w:r>
+        <w:t xml:space="preserve"> </w:t>
+      </w:r>
+      <w:r>
+        <w:rPr>
+          <w:rStyle w:val="VerbatimChar"/>
+        </w:rPr>
+        <w:t xml:space="preserve">worker.ts</w:t>
+      </w:r>
+      <w:r>
+        <w:t xml:space="preserve">,</w:t>
+      </w:r>
+      <w:r>
+        <w:t xml:space="preserve"> </w:t>
+      </w:r>
+      <w:r>
+        <w:rPr>
+          <w:rStyle w:val="VerbatimChar"/>
+        </w:rPr>
+        <w:t xml:space="preserve">storage.ts</w:t>
+      </w:r>
+      <w:r>
+        <w:t xml:space="preserve"> </w:t>
+      </w:r>
+      <w:r>
+        <w:t xml:space="preserve">(</w:t>
+      </w:r>
+      <w:r>
+        <w:rPr>
+          <w:rStyle w:val="VerbatimChar"/>
+        </w:rPr>
+        <w:t xml:space="preserve">cancelBatchRun</w:t>
+      </w:r>
+      <w:r>
+        <w:t xml:space="preserve"> </w:t>
+      </w:r>
+      <w:r>
+        <w:t xml:space="preserve">now returns whether it transitioned the batch; 3 lines) and the new</w:t>
+      </w:r>
+      <w:r>
+        <w:t xml:space="preserve"> </w:t>
+      </w:r>
+      <w:r>
+        <w:rPr>
+          <w:rStyle w:val="VerbatimChar"/>
+        </w:rPr>
+        <w:t xml:space="preserve">batch-stop-rule.ts</w:t>
+      </w:r>
+      <w:r>
+        <w:t xml:space="preserve">. Everything else is tests, fixtures or the repro script.</w:t>
+      </w:r>
+      <w:r>
+        <w:t xml:space="preserve"> </w:t>
+      </w:r>
+      <w:r>
+        <w:rPr>
+          <w:rStyle w:val="VerbatimChar"/>
+        </w:rPr>
+        <w:t xml:space="preserve">lifecycle-fence.db.test.ts</w:t>
+      </w:r>
+      <w:r>
+        <w:t xml:space="preserve"> </w:t>
+      </w:r>
+      <w:r>
+        <w:t xml:space="preserve">changes one type annotation to match</w:t>
+      </w:r>
+      <w:r>
+        <w:t xml:space="preserve"> </w:t>
+      </w:r>
+      <w:r>
+        <w:rPr>
+          <w:rStyle w:val="VerbatimChar"/>
+        </w:rPr>
+        <w:t xml:space="preserve">cancelBatchRun</w:t>
+      </w:r>
+      <w:r>
+        <w:t xml:space="preserve">’s new return type.</w:t>
+      </w:r>
+    </w:p>
+    <w:bookmarkEnd w:id="22"/>
+    <w:bookmarkStart w:id="25" w:name="what-changed"/>
+    <w:p>
+      <w:pPr>
+        <w:pStyle w:val="Heading2"/>
+      </w:pPr>
+      <w:r>
+        <w:t xml:space="preserve">What changed</w:t>
+      </w:r>
+    </w:p>
+    <w:bookmarkStart w:id="23" w:name="Xcda47503f5e0d2ec96407fd4f0322049331da84"/>
+    <w:p>
+      <w:pPr>
+        <w:pStyle w:val="Heading3"/>
+      </w:pPr>
+      <w:r>
+        <w:t xml:space="preserve">server/lib/processor.ts: browser lifetime in isolated children</w:t>
+      </w:r>
+    </w:p>
+    <w:p>
+      <w:pPr>
+        <w:pStyle w:val="FirstParagraph"/>
+      </w:pPr>
+      <w:r>
+        <w:rPr>
           <w:bCs/>
           <w:b/>
         </w:rPr>
-        <w:t xml:space="preserve">Reuse check.</w:t>
-      </w:r>
-      <w:r>
-        <w:t xml:space="preserve"> </w:t>
-      </w:r>
-      <w:r>
-        <w:rPr>
-          <w:rStyle w:val="VerbatimChar"/>
-        </w:rPr>
-        <w:t xml:space="preserve">getSharedBrowser()</w:t>
-      </w:r>
-      <w:r>
-        <w:t xml:space="preserve"> </w:t>
-      </w:r>
-      <w:r>
-        <w:t xml:space="preserve">in an isolated child uses</w:t>
-      </w:r>
-      <w:r>
-        <w:t xml:space="preserve"> </w:t>
-      </w:r>
-      <w:r>
-        <w:rPr>
-          <w:rStyle w:val="VerbatimChar"/>
-        </w:rPr>
-        <w:t xml:space="preserve">browser.connected</w:t>
-      </w:r>
-      <w:r>
-        <w:t xml:space="preserve">. puppeteer-core 25.x has no</w:t>
-      </w:r>
-      <w:r>
-        <w:t xml:space="preserve"> </w:t>
-      </w:r>
-      <w:r>
-        <w:rPr>
-          <w:rStyle w:val="VerbatimChar"/>
-        </w:rPr>
-        <w:t xml:space="preserve">isConnected()</w:t>
-      </w:r>
-      <w:r>
-        <w:t xml:space="preserve">, so the old check always failed. The non-isolated check is unchanged.</w:t>
+        <w:t xml:space="preserve">Defect.</w:t>
+      </w:r>
+      <w:r>
+        <w:t xml:space="preserve"> </w:t>
+      </w:r>
+      <w:r>
+        <w:t xml:space="preserve">In an isolated child, the browser permit, which the parent brokers per replica up to</w:t>
+      </w:r>
+      <w:r>
+        <w:t xml:space="preserve"> </w:t>
+      </w:r>
+      <w:r>
+        <w:rPr>
+          <w:rStyle w:val="VerbatimChar"/>
+        </w:rPr>
+        <w:t xml:space="preserve">MAX_CONCURRENT_BROWSER</w:t>
+      </w:r>
+      <w:r>
+        <w:t xml:space="preserve">, went back to the pool after every fetch. The child’s Chromium stayed alive until the child exited, minutes later. So the number of live browsers per replica was bounded by the child count, not by the permit count. Locally that gave 4 live browsers with 1 permit.</w:t>
+      </w:r>
+    </w:p>
+    <w:p>
+      <w:pPr>
+        <w:pStyle w:val="BodyText"/>
+      </w:pPr>
+      <w:r>
+        <w:rPr>
+          <w:bCs/>
+          <w:b/>
+        </w:rPr>
+        <w:t xml:space="preserve">Fix</w:t>
       </w:r>
     </w:p>
     <w:p>
       <w:pPr>
         <w:numPr>
           <w:ilvl w:val="0"/>
-          <w:numId w:val="1003"/>
+          <w:numId w:val="1004"/>
         </w:numPr>
         <w:pStyle w:val="Compact"/>
       </w:pPr>
@@ -1061,194 +1052,475 @@
         <w:rPr>
           <w:rStyle w:val="VerbatimChar"/>
         </w:rPr>
-        <w:t xml:space="preserve">[BROWSER-LIFECYCLE]</w:t>
-      </w:r>
-      <w:r>
-        <w:t xml:space="preserve"> </w:t>
-      </w:r>
-      <w:r>
-        <w:t xml:space="preserve">log lines record acquire, launch, close, reap and release.</w:t>
-      </w:r>
-    </w:p>
-    <w:bookmarkEnd w:id="23"/>
-    <w:bookmarkStart w:id="24" w:name="X4c9912634b7c6a32f82c869045cf5aa3b70cc23"/>
-    <w:p>
-      <w:pPr>
-        <w:pStyle w:val="Heading3"/>
-      </w:pPr>
-      <w:r>
-        <w:t xml:space="preserve">server/lib/batch-stop-rule.ts and server/worker.ts: stop rule S4</w:t>
-      </w:r>
-    </w:p>
-    <w:p>
-      <w:pPr>
-        <w:pStyle w:val="FirstParagraph"/>
-      </w:pPr>
+        <w:t xml:space="preserve">releaseBrowserSlot()</w:t>
+      </w:r>
+      <w:r>
+        <w:t xml:space="preserve"> </w:t>
+      </w:r>
+      <w:r>
+        <w:t xml:space="preserve">now returns a Promise. In an isolated child it calls</w:t>
+      </w:r>
+      <w:r>
+        <w:t xml:space="preserve"> </w:t>
+      </w:r>
+      <w:r>
+        <w:rPr>
+          <w:rStyle w:val="VerbatimChar"/>
+        </w:rPr>
+        <w:t xml:space="preserve">releaseChildBrowserPermit()</w:t>
+      </w:r>
+      <w:r>
+        <w:t xml:space="preserve">. When the child releases its</w:t>
+      </w:r>
+      <w:r>
+        <w:t xml:space="preserve"> </w:t>
+      </w:r>
       <w:r>
         <w:rPr>
           <w:bCs/>
           <w:b/>
         </w:rPr>
-        <w:t xml:space="preserve">Rule.</w:t>
-      </w:r>
-      <w:r>
-        <w:t xml:space="preserve"> </w:t>
-      </w:r>
-      <w:r>
-        <w:t xml:space="preserve">Validation plan §7 rule S4: cancel the batch once ≥ N jobs have failed, or as soon as any job exhausts its retries.</w:t>
-      </w:r>
-    </w:p>
-    <w:p>
-      <w:pPr>
-        <w:pStyle w:val="BodyText"/>
-      </w:pPr>
-      <w:r>
-        <w:rPr>
-          <w:bCs/>
-          <w:b/>
-        </w:rPr>
-        <w:t xml:space="preserve">Counting.</w:t>
-      </w:r>
-      <w:r>
-        <w:t xml:space="preserve"> </w:t>
-      </w:r>
-      <w:r>
-        <w:t xml:space="preserve">Each job is counted at its</w:t>
-      </w:r>
-      <w:r>
-        <w:t xml:space="preserve"> </w:t>
-      </w:r>
-      <w:r>
-        <w:rPr>
-          <w:bCs/>
-          <w:b/>
-        </w:rPr>
-        <w:t xml:space="preserve">first</w:t>
-      </w:r>
-      <w:r>
-        <w:t xml:space="preserve"> </w:t>
-      </w:r>
-      <w:r>
-        <w:t xml:space="preserve">recorded failed attempt.</w:t>
-      </w:r>
-      <w:r>
-        <w:t xml:space="preserve"> </w:t>
-      </w:r>
-      <w:r>
-        <w:rPr>
-          <w:rStyle w:val="VerbatimChar"/>
-        </w:rPr>
-        <w:t xml:space="preserve">failed_jobs</w:t>
-      </w:r>
-      <w:r>
-        <w:t xml:space="preserve"> </w:t>
-      </w:r>
-      <w:r>
-        <w:t xml:space="preserve">only moves at retry exhaustion, which is why batch 1276 let 13 jobs burn 3 attempts each.</w:t>
-      </w:r>
-    </w:p>
-    <w:p>
-      <w:pPr>
-        <w:pStyle w:val="BodyText"/>
-      </w:pPr>
-      <w:r>
-        <w:rPr>
-          <w:bCs/>
-          <w:b/>
-        </w:rPr>
-        <w:t xml:space="preserve">Where it runs.</w:t>
-      </w:r>
-      <w:r>
-        <w:t xml:space="preserve"> </w:t>
-      </w:r>
-      <w:r>
-        <w:t xml:space="preserve">In</w:t>
-      </w:r>
-      <w:r>
-        <w:t xml:space="preserve"> </w:t>
-      </w:r>
-      <w:r>
-        <w:rPr>
-          <w:rStyle w:val="VerbatimChar"/>
-        </w:rPr>
-        <w:t xml:space="preserve">worker.ts</w:t>
-      </w:r>
-      <w:r>
-        <w:t xml:space="preserve">, on both the failed-result branch and the exception branch, before the retry re-enqueue. When the rule trips, it runs the</w:t>
-      </w:r>
-      <w:r>
-        <w:t xml:space="preserve"> </w:t>
-      </w:r>
-      <w:r>
-        <w:rPr>
-          <w:rStyle w:val="VerbatimChar"/>
-        </w:rPr>
-        <w:t xml:space="preserve">POST /batch/cancel</w:t>
-      </w:r>
-      <w:r>
-        <w:t xml:space="preserve"> </w:t>
-      </w:r>
-      <w:r>
-        <w:t xml:space="preserve">sequence in this order: flag, queue purge, snapshot, PG cancel. The caller then skips the retry.</w:t>
-      </w:r>
-    </w:p>
-    <w:p>
-      <w:pPr>
-        <w:pStyle w:val="BodyText"/>
-      </w:pPr>
-      <w:r>
-        <w:rPr>
-          <w:bCs/>
-          <w:b/>
-        </w:rPr>
-        <w:t xml:space="preserve">Edge cases</w:t>
+        <w:t xml:space="preserve">last</w:t>
+      </w:r>
+      <w:r>
+        <w:t xml:space="preserve"> </w:t>
+      </w:r>
+      <w:r>
+        <w:t xml:space="preserve">held permit, that function does three things in order:</w:t>
       </w:r>
     </w:p>
     <w:p>
       <w:pPr>
         <w:numPr>
-          <w:ilvl w:val="0"/>
+          <w:ilvl w:val="1"/>
           <w:numId w:val="1005"/>
         </w:numPr>
         <w:pStyle w:val="Compact"/>
       </w:pPr>
       <w:r>
-        <w:t xml:space="preserve">Cancellations and provider-quota pauses are not counted.</w:t>
+        <w:t xml:space="preserve">It detaches every Chromium the child launched (</w:t>
+      </w:r>
+      <w:r>
+        <w:rPr>
+          <w:rStyle w:val="VerbatimChar"/>
+        </w:rPr>
+        <w:t xml:space="preserve">childBrowsers</w:t>
+      </w:r>
+      <w:r>
+        <w:t xml:space="preserve">,</w:t>
+      </w:r>
+      <w:r>
+        <w:t xml:space="preserve"> </w:t>
+      </w:r>
+      <w:r>
+        <w:rPr>
+          <w:rStyle w:val="VerbatimChar"/>
+        </w:rPr>
+        <w:t xml:space="preserve">sharedBrowser = null</w:t>
+      </w:r>
+      <w:r>
+        <w:t xml:space="preserve">).</w:t>
       </w:r>
     </w:p>
     <w:p>
       <w:pPr>
         <w:numPr>
-          <w:ilvl w:val="0"/>
+          <w:ilvl w:val="1"/>
           <w:numId w:val="1005"/>
         </w:numPr>
         <w:pStyle w:val="Compact"/>
       </w:pPr>
       <w:r>
-        <w:t xml:space="preserve">If counting errors, the rule fails open to the legacy retry path.</w:t>
+        <w:t xml:space="preserve">It closes each one (</w:t>
+      </w:r>
+      <w:r>
+        <w:rPr>
+          <w:rStyle w:val="VerbatimChar"/>
+        </w:rPr>
+        <w:t xml:space="preserve">close()</w:t>
+      </w:r>
+      <w:r>
+        <w:t xml:space="preserve"> </w:t>
+      </w:r>
+      <w:r>
+        <w:t xml:space="preserve">with a 5 s timeout) and confirms the process group is gone by scanning</w:t>
+      </w:r>
+      <w:r>
+        <w:t xml:space="preserve"> </w:t>
+      </w:r>
+      <w:r>
+        <w:rPr>
+          <w:rStyle w:val="VerbatimChar"/>
+        </w:rPr>
+        <w:t xml:space="preserve">/proc</w:t>
+      </w:r>
+      <w:r>
+        <w:t xml:space="preserve"> </w:t>
+      </w:r>
+      <w:r>
+        <w:t xml:space="preserve">for non-zombie members of the pgid. If the group survives a 5 s window, it sends SIGKILL to the group and checks again.</w:t>
       </w:r>
     </w:p>
     <w:p>
       <w:pPr>
         <w:numPr>
-          <w:ilvl w:val="0"/>
+          <w:ilvl w:val="1"/>
           <w:numId w:val="1005"/>
         </w:numPr>
         <w:pStyle w:val="Compact"/>
       </w:pPr>
       <w:r>
-        <w:t xml:space="preserve">Purge and snapshot errors are not fatal.</w:t>
-      </w:r>
-    </w:p>
-    <w:bookmarkEnd w:id="24"/>
-    <w:bookmarkEnd w:id="25"/>
-    <w:bookmarkStart w:id="26" w:name="review-focus"/>
-    <w:p>
-      <w:pPr>
-        <w:pStyle w:val="Heading2"/>
-      </w:pPr>
-      <w:r>
-        <w:t xml:space="preserve">Review focus</w:t>
+        <w:t xml:space="preserve">Only then does it call</w:t>
+      </w:r>
+      <w:r>
+        <w:t xml:space="preserve"> </w:t>
+      </w:r>
+      <w:r>
+        <w:rPr>
+          <w:rStyle w:val="VerbatimChar"/>
+        </w:rPr>
+        <w:t xml:space="preserve">remoteRelease("browser")</w:t>
+      </w:r>
+      <w:r>
+        <w:t xml:space="preserve">.</w:t>
+      </w:r>
+    </w:p>
+    <w:p>
+      <w:pPr>
+        <w:numPr>
+          <w:ilvl w:val="0"/>
+          <w:numId w:val="1004"/>
+        </w:numPr>
+        <w:pStyle w:val="Compact"/>
+      </w:pPr>
+      <w:r>
+        <w:t xml:space="preserve">If there is no pid to probe, only a close that completed counts as confirmed.</w:t>
+      </w:r>
+    </w:p>
+    <w:p>
+      <w:pPr>
+        <w:numPr>
+          <w:ilvl w:val="0"/>
+          <w:numId w:val="1004"/>
+        </w:numPr>
+        <w:pStyle w:val="Compact"/>
+      </w:pPr>
+      <w:r>
+        <w:rPr>
+          <w:bCs/>
+          <w:b/>
+        </w:rPr>
+        <w:t xml:space="preserve">Unconfirmed cleanup.</w:t>
+      </w:r>
+      <w:r>
+        <w:t xml:space="preserve"> </w:t>
+      </w:r>
+      <w:r>
+        <w:t xml:space="preserve">The permit is</w:t>
+      </w:r>
+      <w:r>
+        <w:t xml:space="preserve"> </w:t>
+      </w:r>
+      <w:r>
+        <w:rPr>
+          <w:bCs/>
+          <w:b/>
+        </w:rPr>
+        <w:t xml:space="preserve">withheld</w:t>
+      </w:r>
+      <w:r>
+        <w:t xml:space="preserve">, not returned, and</w:t>
+      </w:r>
+      <w:r>
+        <w:t xml:space="preserve"> </w:t>
+      </w:r>
+      <w:r>
+        <w:rPr>
+          <w:rStyle w:val="VerbatimChar"/>
+        </w:rPr>
+        <w:t xml:space="preserve">childBrowserRetireFailed</w:t>
+      </w:r>
+      <w:r>
+        <w:t xml:space="preserve"> </w:t>
+      </w:r>
+      <w:r>
+        <w:t xml:space="preserve">opens the browser circuit for that child, so it cannot deadlock itself. The parent reaps the process when the child exits.</w:t>
+      </w:r>
+    </w:p>
+    <w:p>
+      <w:pPr>
+        <w:numPr>
+          <w:ilvl w:val="0"/>
+          <w:numId w:val="1004"/>
+        </w:numPr>
+        <w:pStyle w:val="Compact"/>
+      </w:pPr>
+      <w:r>
+        <w:t xml:space="preserve">All three callers await the release, on the normal, refused-after-acquire and finally paths:</w:t>
+      </w:r>
+      <w:r>
+        <w:t xml:space="preserve"> </w:t>
+      </w:r>
+      <w:r>
+        <w:rPr>
+          <w:rStyle w:val="VerbatimChar"/>
+        </w:rPr>
+        <w:t xml:space="preserve">fetchWithBrowser</w:t>
+      </w:r>
+      <w:r>
+        <w:t xml:space="preserve">,</w:t>
+      </w:r>
+      <w:r>
+        <w:t xml:space="preserve"> </w:t>
+      </w:r>
+      <w:r>
+        <w:rPr>
+          <w:rStyle w:val="VerbatimChar"/>
+        </w:rPr>
+        <w:t xml:space="preserve">fetchPdfViaBrowser</w:t>
+      </w:r>
+      <w:r>
+        <w:t xml:space="preserve"> </w:t>
+      </w:r>
+      <w:r>
+        <w:t xml:space="preserve">and</w:t>
+      </w:r>
+      <w:r>
+        <w:t xml:space="preserve"> </w:t>
+      </w:r>
+      <w:r>
+        <w:rPr>
+          <w:rStyle w:val="VerbatimChar"/>
+        </w:rPr>
+        <w:t xml:space="preserve">fetchIssuerPdfsWithPrimedSession</w:t>
+      </w:r>
+      <w:r>
+        <w:t xml:space="preserve">.</w:t>
+      </w:r>
+      <w:r>
+        <w:t xml:space="preserve"> </w:t>
+      </w:r>
+      <w:r>
+        <w:rPr>
+          <w:rStyle w:val="VerbatimChar"/>
+        </w:rPr>
+        <w:t xml:space="preserve">fetchIssuerPdfsWithPrimedSession</w:t>
+      </w:r>
+      <w:r>
+        <w:t xml:space="preserve"> </w:t>
+      </w:r>
+      <w:r>
+        <w:t xml:space="preserve">also returns early if the circuit is open.</w:t>
+      </w:r>
+    </w:p>
+    <w:p>
+      <w:pPr>
+        <w:numPr>
+          <w:ilvl w:val="0"/>
+          <w:numId w:val="1004"/>
+        </w:numPr>
+        <w:pStyle w:val="Compact"/>
+      </w:pPr>
+      <w:r>
+        <w:rPr>
+          <w:bCs/>
+          <w:b/>
+        </w:rPr>
+        <w:t xml:space="preserve">Reuse check.</w:t>
+      </w:r>
+      <w:r>
+        <w:t xml:space="preserve"> </w:t>
+      </w:r>
+      <w:r>
+        <w:rPr>
+          <w:rStyle w:val="VerbatimChar"/>
+        </w:rPr>
+        <w:t xml:space="preserve">getSharedBrowser()</w:t>
+      </w:r>
+      <w:r>
+        <w:t xml:space="preserve"> </w:t>
+      </w:r>
+      <w:r>
+        <w:t xml:space="preserve">in an isolated child uses</w:t>
+      </w:r>
+      <w:r>
+        <w:t xml:space="preserve"> </w:t>
+      </w:r>
+      <w:r>
+        <w:rPr>
+          <w:rStyle w:val="VerbatimChar"/>
+        </w:rPr>
+        <w:t xml:space="preserve">browser.connected</w:t>
+      </w:r>
+      <w:r>
+        <w:t xml:space="preserve">. puppeteer-core 25.x has no</w:t>
+      </w:r>
+      <w:r>
+        <w:t xml:space="preserve"> </w:t>
+      </w:r>
+      <w:r>
+        <w:rPr>
+          <w:rStyle w:val="VerbatimChar"/>
+        </w:rPr>
+        <w:t xml:space="preserve">isConnected()</w:t>
+      </w:r>
+      <w:r>
+        <w:t xml:space="preserve">, so the old check always failed. The non-isolated check is unchanged.</w:t>
+      </w:r>
+    </w:p>
+    <w:p>
+      <w:pPr>
+        <w:numPr>
+          <w:ilvl w:val="0"/>
+          <w:numId w:val="1004"/>
+        </w:numPr>
+        <w:pStyle w:val="Compact"/>
+      </w:pPr>
+      <w:r>
+        <w:rPr>
+          <w:rStyle w:val="VerbatimChar"/>
+        </w:rPr>
+        <w:t xml:space="preserve">[BROWSER-LIFECYCLE]</w:t>
+      </w:r>
+      <w:r>
+        <w:t xml:space="preserve"> </w:t>
+      </w:r>
+      <w:r>
+        <w:t xml:space="preserve">log lines record acquire, launch, close, reap and release.</w:t>
+      </w:r>
+    </w:p>
+    <w:bookmarkEnd w:id="23"/>
+    <w:bookmarkStart w:id="24" w:name="X4c9912634b7c6a32f82c869045cf5aa3b70cc23"/>
+    <w:p>
+      <w:pPr>
+        <w:pStyle w:val="Heading3"/>
+      </w:pPr>
+      <w:r>
+        <w:t xml:space="preserve">server/lib/batch-stop-rule.ts and server/worker.ts: stop rule S4</w:t>
+      </w:r>
+    </w:p>
+    <w:p>
+      <w:pPr>
+        <w:pStyle w:val="FirstParagraph"/>
+      </w:pPr>
+      <w:r>
+        <w:rPr>
+          <w:bCs/>
+          <w:b/>
+        </w:rPr>
+        <w:t xml:space="preserve">Rule.</w:t>
+      </w:r>
+      <w:r>
+        <w:t xml:space="preserve"> </w:t>
+      </w:r>
+      <w:r>
+        <w:t xml:space="preserve">Validation plan §7 rule S4: cancel the batch once ≥ N jobs have failed, or as soon as any job exhausts its retries.</w:t>
+      </w:r>
+    </w:p>
+    <w:p>
+      <w:pPr>
+        <w:pStyle w:val="BodyText"/>
+      </w:pPr>
+      <w:r>
+        <w:rPr>
+          <w:bCs/>
+          <w:b/>
+        </w:rPr>
+        <w:t xml:space="preserve">Counting.</w:t>
+      </w:r>
+      <w:r>
+        <w:t xml:space="preserve"> </w:t>
+      </w:r>
+      <w:r>
+        <w:t xml:space="preserve">Each job is counted at its</w:t>
+      </w:r>
+      <w:r>
+        <w:t xml:space="preserve"> </w:t>
+      </w:r>
+      <w:r>
+        <w:rPr>
+          <w:bCs/>
+          <w:b/>
+        </w:rPr>
+        <w:t xml:space="preserve">first</w:t>
+      </w:r>
+      <w:r>
+        <w:t xml:space="preserve"> </w:t>
+      </w:r>
+      <w:r>
+        <w:t xml:space="preserve">recorded failed attempt.</w:t>
+      </w:r>
+      <w:r>
+        <w:t xml:space="preserve"> </w:t>
+      </w:r>
+      <w:r>
+        <w:rPr>
+          <w:rStyle w:val="VerbatimChar"/>
+        </w:rPr>
+        <w:t xml:space="preserve">failed_jobs</w:t>
+      </w:r>
+      <w:r>
+        <w:t xml:space="preserve"> </w:t>
+      </w:r>
+      <w:r>
+        <w:t xml:space="preserve">only moves at retry exhaustion, which is why batch 1276 let 13 jobs burn 3 attempts each.</w:t>
+      </w:r>
+    </w:p>
+    <w:p>
+      <w:pPr>
+        <w:pStyle w:val="BodyText"/>
+      </w:pPr>
+      <w:r>
+        <w:rPr>
+          <w:bCs/>
+          <w:b/>
+        </w:rPr>
+        <w:t xml:space="preserve">Where it runs.</w:t>
+      </w:r>
+      <w:r>
+        <w:t xml:space="preserve"> </w:t>
+      </w:r>
+      <w:r>
+        <w:t xml:space="preserve">In</w:t>
+      </w:r>
+      <w:r>
+        <w:t xml:space="preserve"> </w:t>
+      </w:r>
+      <w:r>
+        <w:rPr>
+          <w:rStyle w:val="VerbatimChar"/>
+        </w:rPr>
+        <w:t xml:space="preserve">worker.ts</w:t>
+      </w:r>
+      <w:r>
+        <w:t xml:space="preserve">, on both the failed-result branch and the exception branch, before the retry re-enqueue. The caller skips the retry whenever the rule trips.</w:t>
+      </w:r>
+    </w:p>
+    <w:p>
+      <w:pPr>
+        <w:pStyle w:val="BodyText"/>
+      </w:pPr>
+      <w:r>
+        <w:rPr>
+          <w:bCs/>
+          <w:b/>
+        </w:rPr>
+        <w:t xml:space="preserve">Cancel sequence (</w:t>
+      </w:r>
+      <w:r>
+        <w:rPr>
+          <w:rStyle w:val="VerbatimChar"/>
+          <w:bCs/>
+          <w:b/>
+        </w:rPr>
+        <w:t xml:space="preserve">runStopRuleCancelSequence</w:t>
+      </w:r>
+      <w:r>
+        <w:rPr>
+          <w:bCs/>
+          <w:b/>
+        </w:rPr>
+        <w:t xml:space="preserve">, durable first).</w:t>
       </w:r>
     </w:p>
     <w:p>
@@ -1263,34 +1535,19 @@
         <w:rPr>
           <w:rStyle w:val="VerbatimChar"/>
         </w:rPr>
-        <w:t xml:space="preserve">processor.ts</w:t>
-      </w:r>
-      <w:r>
-        <w:t xml:space="preserve"> </w:t>
-      </w:r>
-      <w:r>
-        <w:rPr>
-          <w:rStyle w:val="VerbatimChar"/>
-        </w:rPr>
-        <w:t xml:space="preserve">releaseChildBrowserPermit()</w:t>
-      </w:r>
-      <w:r>
-        <w:t xml:space="preserve"> </w:t>
-      </w:r>
-      <w:r>
-        <w:t xml:space="preserve">/</w:t>
-      </w:r>
-      <w:r>
-        <w:t xml:space="preserve"> </w:t>
-      </w:r>
-      <w:r>
-        <w:rPr>
-          <w:rStyle w:val="VerbatimChar"/>
-        </w:rPr>
-        <w:t xml:space="preserve">retireChildBrowser()</w:t>
-      </w:r>
-      <w:r>
-        <w:t xml:space="preserve">: the ordering, the withheld-permit path and the no-pid case.</w:t>
+        <w:t xml:space="preserve">flag</w:t>
+      </w:r>
+      <w:r>
+        <w:t xml:space="preserve">: the local cancelled set + the Redis cross-replica notification (</w:t>
+      </w:r>
+      <w:r>
+        <w:rPr>
+          <w:rStyle w:val="VerbatimChar"/>
+        </w:rPr>
+        <w:t xml:space="preserve">worker.cancelBatch</w:t>
+      </w:r>
+      <w:r>
+        <w:t xml:space="preserve">), synchronous, so no new claim starts.</w:t>
       </w:r>
     </w:p>
     <w:p>
@@ -1305,34 +1562,95 @@
         <w:rPr>
           <w:rStyle w:val="VerbatimChar"/>
         </w:rPr>
-        <w:t xml:space="preserve">worker.ts</w:t>
-      </w:r>
-      <w:r>
-        <w:t xml:space="preserve"> </w:t>
-      </w:r>
-      <w:r>
-        <w:rPr>
-          <w:rStyle w:val="VerbatimChar"/>
-        </w:rPr>
-        <w:t xml:space="preserve">stopRuleTripped()</w:t>
-      </w:r>
-      <w:r>
-        <w:t xml:space="preserve">: where it sits relative to</w:t>
-      </w:r>
-      <w:r>
-        <w:t xml:space="preserve"> </w:t>
-      </w:r>
-      <w:r>
-        <w:rPr>
-          <w:rStyle w:val="VerbatimChar"/>
-        </w:rPr>
-        <w:t xml:space="preserve">batchTerminal</w:t>
-      </w:r>
-      <w:r>
-        <w:t xml:space="preserve"> </w:t>
-      </w:r>
-      <w:r>
-        <w:t xml:space="preserve">and the retry branch.</w:t>
+        <w:t xml:space="preserve">pgCancel</w:t>
+      </w:r>
+      <w:r>
+        <w:t xml:space="preserve"> </w:t>
+      </w:r>
+      <w:r>
+        <w:t xml:space="preserve">(</w:t>
+      </w:r>
+      <w:r>
+        <w:rPr>
+          <w:rStyle w:val="VerbatimChar"/>
+        </w:rPr>
+        <w:t xml:space="preserve">storage.cancelBatchRun</w:t>
+      </w:r>
+      <w:r>
+        <w:t xml:space="preserve">, the durable</w:t>
+      </w:r>
+      <w:r>
+        <w:t xml:space="preserve"> </w:t>
+      </w:r>
+      <w:r>
+        <w:rPr>
+          <w:rStyle w:val="VerbatimChar"/>
+        </w:rPr>
+        <w:t xml:space="preserve">batch_runs.status='cancelled'</w:t>
+      </w:r>
+      <w:r>
+        <w:t xml:space="preserve"> </w:t>
+      </w:r>
+      <w:r>
+        <w:t xml:space="preserve">write that</w:t>
+      </w:r>
+      <w:r>
+        <w:t xml:space="preserve"> </w:t>
+      </w:r>
+      <w:r>
+        <w:rPr>
+          <w:rStyle w:val="VerbatimChar"/>
+        </w:rPr>
+        <w:t xml:space="preserve">claimJob</w:t>
+      </w:r>
+      <w:r>
+        <w:t xml:space="preserve"> </w:t>
+      </w:r>
+      <w:r>
+        <w:t xml:space="preserve">fences on) and the BullMQ</w:t>
+      </w:r>
+      <w:r>
+        <w:t xml:space="preserve"> </w:t>
+      </w:r>
+      <w:r>
+        <w:rPr>
+          <w:rStyle w:val="VerbatimChar"/>
+        </w:rPr>
+        <w:t xml:space="preserve">purge</w:t>
+      </w:r>
+      <w:r>
+        <w:t xml:space="preserve"> </w:t>
+      </w:r>
+      <w:r>
+        <w:t xml:space="preserve">start</w:t>
+      </w:r>
+      <w:r>
+        <w:t xml:space="preserve"> </w:t>
+      </w:r>
+      <w:r>
+        <w:rPr>
+          <w:bCs/>
+          <w:b/>
+        </w:rPr>
+        <w:t xml:space="preserve">together</w:t>
+      </w:r>
+      <w:r>
+        <w:t xml:space="preserve">. The PG cancel is never gated behind the purge. The purge is bounded by</w:t>
+      </w:r>
+      <w:r>
+        <w:t xml:space="preserve"> </w:t>
+      </w:r>
+      <w:r>
+        <w:rPr>
+          <w:rStyle w:val="VerbatimChar"/>
+        </w:rPr>
+        <w:t xml:space="preserve">STOP_RULE_PURGE_TIMEOUT_MS</w:t>
+      </w:r>
+      <w:r>
+        <w:t xml:space="preserve"> </w:t>
+      </w:r>
+      <w:r>
+        <w:t xml:space="preserve">(10 s); a hang or error is logged and abandoned.</w:t>
       </w:r>
     </w:p>
     <w:p>
@@ -1344,13 +1662,400 @@
         <w:pStyle w:val="Compact"/>
       </w:pPr>
       <w:r>
+        <w:t xml:space="preserve">Only if the PG cancel committed</w:t>
+      </w:r>
+      <w:r>
+        <w:t xml:space="preserve"> </w:t>
+      </w:r>
+      <w:r>
+        <w:rPr>
+          <w:bCs/>
+          <w:b/>
+        </w:rPr>
+        <w:t xml:space="preserve">and</w:t>
+      </w:r>
+      <w:r>
+        <w:t xml:space="preserve"> </w:t>
+      </w:r>
+      <w:r>
+        <w:t xml:space="preserve">this call transitioned the batch (</w:t>
+      </w:r>
+      <w:r>
+        <w:rPr>
+          <w:rStyle w:val="VerbatimChar"/>
+        </w:rPr>
+        <w:t xml:space="preserve">cancelBatchRun</w:t>
+      </w:r>
+      <w:r>
+        <w:t xml:space="preserve"> </w:t>
+      </w:r>
+      <w:r>
+        <w:t xml:space="preserve">→</w:t>
+      </w:r>
+      <w:r>
+        <w:t xml:space="preserve"> </w:t>
+      </w:r>
+      <w:r>
+        <w:rPr>
+          <w:rStyle w:val="VerbatimChar"/>
+        </w:rPr>
+        <w:t xml:space="preserve">true</w:t>
+      </w:r>
+      <w:r>
+        <w:t xml:space="preserve">): the snapshot, bounded by</w:t>
+      </w:r>
+      <w:r>
+        <w:t xml:space="preserve"> </w:t>
+      </w:r>
+      <w:r>
+        <w:rPr>
+          <w:rStyle w:val="VerbatimChar"/>
+        </w:rPr>
+        <w:t xml:space="preserve">STOP_RULE_SNAPSHOT_TIMEOUT_MS</w:t>
+      </w:r>
+      <w:r>
+        <w:t xml:space="preserve"> </w:t>
+      </w:r>
+      <w:r>
+        <w:t xml:space="preserve">(30 s).</w:t>
+      </w:r>
+      <w:r>
+        <w:t xml:space="preserve"> </w:t>
+      </w:r>
+      <w:r>
+        <w:rPr>
+          <w:rStyle w:val="VerbatimChar"/>
+        </w:rPr>
+        <w:t xml:space="preserve">saveStopRuleSnapshot</w:t>
+      </w:r>
+      <w:r>
+        <w:t xml:space="preserve"> </w:t>
+      </w:r>
+      <w:r>
+        <w:t xml:space="preserve">saves the completed companies like</w:t>
+      </w:r>
+      <w:r>
+        <w:t xml:space="preserve"> </w:t>
+      </w:r>
+      <w:r>
+        <w:rPr>
+          <w:rStyle w:val="VerbatimChar"/>
+        </w:rPr>
+        <w:t xml:space="preserve">POST /batch/cancel</w:t>
+      </w:r>
+      <w:r>
+        <w:t xml:space="preserve">, then marks every snapshot row of the batch</w:t>
+      </w:r>
+      <w:r>
+        <w:t xml:space="preserve"> </w:t>
+      </w:r>
+      <w:r>
+        <w:rPr>
+          <w:rStyle w:val="VerbatimChar"/>
+        </w:rPr>
+        <w:t xml:space="preserve">acceptance_state='rejected'</w:t>
+      </w:r>
+      <w:r>
+        <w:t xml:space="preserve">,</w:t>
+      </w:r>
+      <w:r>
+        <w:t xml:space="preserve"> </w:t>
+      </w:r>
+      <w:r>
+        <w:rPr>
+          <w:rStyle w:val="VerbatimChar"/>
+        </w:rPr>
+        <w:t xml:space="preserve">accepted_at=NULL</w:t>
+      </w:r>
+      <w:r>
+        <w:t xml:space="preserve">,</w:t>
+      </w:r>
+      <w:r>
+        <w:t xml:space="preserve"> </w:t>
+      </w:r>
+      <w:r>
+        <w:rPr>
+          <w:rStyle w:val="VerbatimChar"/>
+        </w:rPr>
+        <w:t xml:space="preserve">rejection_reason='cancelled/partial snapshot — batch stopped by …; not comprehensive'</w:t>
+      </w:r>
+      <w:r>
+        <w:t xml:space="preserve">.</w:t>
+      </w:r>
+    </w:p>
+    <w:p>
+      <w:pPr>
+        <w:numPr>
+          <w:ilvl w:val="0"/>
+          <w:numId w:val="1006"/>
+        </w:numPr>
+        <w:pStyle w:val="Compact"/>
+      </w:pPr>
+      <w:r>
+        <w:t xml:space="preserve">A racing path whose</w:t>
+      </w:r>
+      <w:r>
+        <w:t xml:space="preserve"> </w:t>
+      </w:r>
+      <w:r>
+        <w:rPr>
+          <w:rStyle w:val="VerbatimChar"/>
+        </w:rPr>
+        <w:t xml:space="preserve">cancelBatchRun</w:t>
+      </w:r>
+      <w:r>
+        <w:t xml:space="preserve"> </w:t>
+      </w:r>
+      <w:r>
+        <w:t xml:space="preserve">was the idempotent no-op (</w:t>
+      </w:r>
+      <w:r>
+        <w:rPr>
+          <w:rStyle w:val="VerbatimChar"/>
+        </w:rPr>
+        <w:t xml:space="preserve">false</w:t>
+      </w:r>
+      <w:r>
+        <w:t xml:space="preserve">) takes no snapshot, so there is no duplicate.</w:t>
+      </w:r>
+    </w:p>
+    <w:p>
+      <w:pPr>
+        <w:pStyle w:val="FirstParagraph"/>
+      </w:pPr>
+      <w:r>
+        <w:rPr>
+          <w:bCs/>
+          <w:b/>
+        </w:rPr>
+        <w:t xml:space="preserve">Edge cases</w:t>
+      </w:r>
+    </w:p>
+    <w:p>
+      <w:pPr>
+        <w:numPr>
+          <w:ilvl w:val="0"/>
+          <w:numId w:val="1007"/>
+        </w:numPr>
+        <w:pStyle w:val="Compact"/>
+      </w:pPr>
+      <w:r>
+        <w:t xml:space="preserve">Cancellations and provider-quota pauses are not counted.</w:t>
+      </w:r>
+    </w:p>
+    <w:p>
+      <w:pPr>
+        <w:numPr>
+          <w:ilvl w:val="0"/>
+          <w:numId w:val="1007"/>
+        </w:numPr>
+        <w:pStyle w:val="Compact"/>
+      </w:pPr>
+      <w:r>
+        <w:t xml:space="preserve">If counting errors, the rule fails open to the legacy retry path.</w:t>
+      </w:r>
+    </w:p>
+    <w:p>
+      <w:pPr>
+        <w:numPr>
+          <w:ilvl w:val="0"/>
+          <w:numId w:val="1007"/>
+        </w:numPr>
+        <w:pStyle w:val="Compact"/>
+      </w:pPr>
+      <w:r>
+        <w:t xml:space="preserve">Purge and snapshot errors or hangs are non-fatal and bounded. A PG-cancel error propagates after the bounded purge, with no snapshot taken, and the caller still suppresses the retry.</w:t>
+      </w:r>
+    </w:p>
+    <w:bookmarkEnd w:id="24"/>
+    <w:bookmarkEnd w:id="25"/>
+    <w:bookmarkStart w:id="26" w:name="review-focus"/>
+    <w:p>
+      <w:pPr>
+        <w:pStyle w:val="Heading2"/>
+      </w:pPr>
+      <w:r>
+        <w:t xml:space="preserve">Review focus</w:t>
+      </w:r>
+    </w:p>
+    <w:p>
+      <w:pPr>
+        <w:numPr>
+          <w:ilvl w:val="0"/>
+          <w:numId w:val="1008"/>
+        </w:numPr>
+        <w:pStyle w:val="Compact"/>
+      </w:pPr>
+      <w:r>
+        <w:rPr>
+          <w:rStyle w:val="VerbatimChar"/>
+        </w:rPr>
+        <w:t xml:space="preserve">processor.ts</w:t>
+      </w:r>
+      <w:r>
+        <w:t xml:space="preserve"> </w:t>
+      </w:r>
+      <w:r>
+        <w:rPr>
+          <w:rStyle w:val="VerbatimChar"/>
+        </w:rPr>
+        <w:t xml:space="preserve">releaseChildBrowserPermit()</w:t>
+      </w:r>
+      <w:r>
+        <w:t xml:space="preserve"> </w:t>
+      </w:r>
+      <w:r>
+        <w:t xml:space="preserve">/</w:t>
+      </w:r>
+      <w:r>
+        <w:t xml:space="preserve"> </w:t>
+      </w:r>
+      <w:r>
+        <w:rPr>
+          <w:rStyle w:val="VerbatimChar"/>
+        </w:rPr>
+        <w:t xml:space="preserve">retireChildBrowser()</w:t>
+      </w:r>
+      <w:r>
+        <w:t xml:space="preserve">: the ordering, the withheld-permit path and the no-pid case.</w:t>
+      </w:r>
+    </w:p>
+    <w:p>
+      <w:pPr>
+        <w:numPr>
+          <w:ilvl w:val="0"/>
+          <w:numId w:val="1008"/>
+        </w:numPr>
+        <w:pStyle w:val="Compact"/>
+      </w:pPr>
+      <w:r>
+        <w:rPr>
+          <w:rStyle w:val="VerbatimChar"/>
+        </w:rPr>
+        <w:t xml:space="preserve">worker.ts</w:t>
+      </w:r>
+      <w:r>
+        <w:t xml:space="preserve"> </w:t>
+      </w:r>
+      <w:r>
+        <w:rPr>
+          <w:rStyle w:val="VerbatimChar"/>
+        </w:rPr>
+        <w:t xml:space="preserve">stopRuleTripped()</w:t>
+      </w:r>
+      <w:r>
+        <w:t xml:space="preserve">: where it sits relative to</w:t>
+      </w:r>
+      <w:r>
+        <w:t xml:space="preserve"> </w:t>
+      </w:r>
+      <w:r>
+        <w:rPr>
+          <w:rStyle w:val="VerbatimChar"/>
+        </w:rPr>
+        <w:t xml:space="preserve">batchTerminal</w:t>
+      </w:r>
+      <w:r>
+        <w:t xml:space="preserve"> </w:t>
+      </w:r>
+      <w:r>
+        <w:t xml:space="preserve">and the retry branch.</w:t>
+      </w:r>
+    </w:p>
+    <w:p>
+      <w:pPr>
+        <w:numPr>
+          <w:ilvl w:val="0"/>
+          <w:numId w:val="1008"/>
+        </w:numPr>
+        <w:pStyle w:val="Compact"/>
+      </w:pPr>
+      <w:r>
+        <w:rPr>
+          <w:rStyle w:val="VerbatimChar"/>
+        </w:rPr>
+        <w:t xml:space="preserve">batch-stop-rule.ts</w:t>
+      </w:r>
+      <w:r>
+        <w:t xml:space="preserve"> </w:t>
+      </w:r>
+      <w:r>
+        <w:rPr>
+          <w:rStyle w:val="VerbatimChar"/>
+        </w:rPr>
+        <w:t xml:space="preserve">runStopRuleCancelSequence()</w:t>
+      </w:r>
+      <w:r>
+        <w:t xml:space="preserve"> </w:t>
+      </w:r>
+      <w:r>
+        <w:t xml:space="preserve">/</w:t>
+      </w:r>
+      <w:r>
+        <w:t xml:space="preserve"> </w:t>
+      </w:r>
+      <w:r>
+        <w:rPr>
+          <w:rStyle w:val="VerbatimChar"/>
+        </w:rPr>
+        <w:t xml:space="preserve">bounded()</w:t>
+      </w:r>
+      <w:r>
+        <w:t xml:space="preserve"> </w:t>
+      </w:r>
+      <w:r>
+        <w:t xml:space="preserve">and</w:t>
+      </w:r>
+      <w:r>
+        <w:t xml:space="preserve"> </w:t>
+      </w:r>
+      <w:r>
+        <w:rPr>
+          <w:rStyle w:val="VerbatimChar"/>
+        </w:rPr>
+        <w:t xml:space="preserve">worker.ts</w:t>
+      </w:r>
+      <w:r>
+        <w:t xml:space="preserve"> </w:t>
+      </w:r>
+      <w:r>
+        <w:rPr>
+          <w:rStyle w:val="VerbatimChar"/>
+        </w:rPr>
+        <w:t xml:space="preserve">saveStopRuleSnapshot()</w:t>
+      </w:r>
+      <w:r>
+        <w:t xml:space="preserve">: durable-first ordering, the timeouts, and snapshot-only-on-transition.</w:t>
+      </w:r>
+    </w:p>
+    <w:p>
+      <w:pPr>
+        <w:numPr>
+          <w:ilvl w:val="0"/>
+          <w:numId w:val="1008"/>
+        </w:numPr>
+        <w:pStyle w:val="Compact"/>
+      </w:pPr>
+      <w:r>
         <w:rPr>
           <w:rStyle w:val="VerbatimChar"/>
         </w:rPr>
         <w:t xml:space="preserve">COUNT_BATCH_FAILURES_SQL</w:t>
       </w:r>
       <w:r>
-        <w:t xml:space="preserve">: not yet run against a real PG in this session (optional test skipped). See</w:t>
+        <w:t xml:space="preserve">: now run against a disposable local PG (unit SQL test, and the real-PG race test</w:t>
+      </w:r>
+      <w:r>
+        <w:t xml:space="preserve"> </w:t>
+      </w:r>
+      <w:r>
+        <w:rPr>
+          <w:rStyle w:val="VerbatimChar"/>
+        </w:rPr>
+        <w:t xml:space="preserve">batch-stop-rule.db.test.ts</w:t>
+      </w:r>
+      <w:r>
+        <w:t xml:space="preserve">, 17/17). See</w:t>
       </w:r>
       <w:r>
         <w:t xml:space="preserve"> </w:t>
@@ -1650,6 +2355,9 @@
     <w:abstractNumId w:val="991"/>
   </w:num>
   <w:num w:numId="1004">
+    <w:abstractNumId w:val="991"/>
+  </w:num>
+  <w:num w:numId="1005">
     <w:abstractNumId w:val="99411"/>
     <w:lvlOverride w:ilvl="0">
       <w:startOverride w:val="1"/>
@@ -1679,10 +2387,40 @@
       <w:startOverride w:val="1"/>
     </w:lvlOverride>
   </w:num>
-  <w:num w:numId="1005">
+  <w:num w:numId="1006">
+    <w:abstractNumId w:val="99411"/>
+    <w:lvlOverride w:ilvl="0">
+      <w:startOverride w:val="1"/>
+    </w:lvlOverride>
+    <w:lvlOverride w:ilvl="1">
+      <w:startOverride w:val="1"/>
+    </w:lvlOverride>
+    <w:lvlOverride w:ilvl="2">
+      <w:startOverride w:val="1"/>
+    </w:lvlOverride>
+    <w:lvlOverride w:ilvl="3">
+      <w:startOverride w:val="1"/>
+    </w:lvlOverride>
+    <w:lvlOverride w:ilvl="4">
+      <w:startOverride w:val="1"/>
+    </w:lvlOverride>
+    <w:lvlOverride w:ilvl="5">
+      <w:startOverride w:val="1"/>
+    </w:lvlOverride>
+    <w:lvlOverride w:ilvl="6">
+      <w:startOverride w:val="1"/>
+    </w:lvlOverride>
+    <w:lvlOverride w:ilvl="7">
+      <w:startOverride w:val="1"/>
+    </w:lvlOverride>
+    <w:lvlOverride w:ilvl="8">
+      <w:startOverride w:val="1"/>
+    </w:lvlOverride>
+  </w:num>
+  <w:num w:numId="1007">
     <w:abstractNumId w:val="991"/>
   </w:num>
-  <w:num w:numId="1006">
+  <w:num w:numId="1008">
     <w:abstractNumId w:val="99411"/>
     <w:lvlOverride w:ilvl="0">
       <w:startOverride w:val="1"/>

</xml_diff>